<commit_message>
feat: make the schedules rerun depending on the frequency
</commit_message>
<xml_diff>
--- a/doc/VTU API PLAN.docx
+++ b/doc/VTU API PLAN.docx
@@ -1728,7 +1728,7 @@
         <mc:AlternateContent>
           <mc:Choice Requires="wps">
             <w:drawing>
-              <wp:anchor distT="0" distB="0" distL="114300" distR="114300" simplePos="0" relativeHeight="251662336" behindDoc="0" locked="0" layoutInCell="1" allowOverlap="1">
+              <wp:anchor distT="0" distB="0" distL="114300" distR="114300" simplePos="0" relativeHeight="251662336" behindDoc="0" locked="0" layoutInCell="1" allowOverlap="1" wp14:anchorId="6C0D2EC4" wp14:editId="50C80C90">
                 <wp:simplePos x="0" y="0"/>
                 <wp:positionH relativeFrom="column">
                   <wp:posOffset>-12700</wp:posOffset>
@@ -1853,8 +1853,6 @@
                               </w:rPr>
                               <w:t>Phone</w:t>
                             </w:r>
-                            <w:bookmarkStart w:id="0" w:name="_GoBack"/>
-                            <w:bookmarkEnd w:id="0"/>
                             <w:r>
                               <w:rPr>
                                 <w:color w:val="00B050"/>
@@ -2085,6 +2083,79 @@
           </mc:Fallback>
         </mc:AlternateContent>
       </w:r>
+    </w:p>
+    <w:p>
+      <w:pPr>
+        <w:rPr>
+          <w:sz w:val="24"/>
+          <w:szCs w:val="24"/>
+        </w:rPr>
+      </w:pPr>
+    </w:p>
+    <w:p>
+      <w:pPr>
+        <w:rPr>
+          <w:sz w:val="24"/>
+          <w:szCs w:val="24"/>
+        </w:rPr>
+      </w:pPr>
+    </w:p>
+    <w:p>
+      <w:pPr>
+        <w:rPr>
+          <w:sz w:val="24"/>
+          <w:szCs w:val="24"/>
+        </w:rPr>
+      </w:pPr>
+    </w:p>
+    <w:p>
+      <w:pPr>
+        <w:rPr>
+          <w:sz w:val="24"/>
+          <w:szCs w:val="24"/>
+        </w:rPr>
+      </w:pPr>
+    </w:p>
+    <w:p>
+      <w:pPr>
+        <w:rPr>
+          <w:sz w:val="24"/>
+          <w:szCs w:val="24"/>
+        </w:rPr>
+      </w:pPr>
+    </w:p>
+    <w:p>
+      <w:pPr>
+        <w:rPr>
+          <w:sz w:val="24"/>
+          <w:szCs w:val="24"/>
+        </w:rPr>
+      </w:pPr>
+    </w:p>
+    <w:p>
+      <w:pPr>
+        <w:rPr>
+          <w:sz w:val="24"/>
+          <w:szCs w:val="24"/>
+        </w:rPr>
+      </w:pPr>
+    </w:p>
+    <w:p>
+      <w:pPr>
+        <w:rPr>
+          <w:sz w:val="24"/>
+          <w:szCs w:val="24"/>
+        </w:rPr>
+      </w:pPr>
+      <w:r>
+        <w:rPr>
+          <w:sz w:val="24"/>
+          <w:szCs w:val="24"/>
+        </w:rPr>
+        <w:t>The Ping functionality was the main problem of the project, I understood this why building it.</w:t>
+      </w:r>
+      <w:bookmarkStart w:id="0" w:name="_GoBack"/>
+      <w:bookmarkEnd w:id="0"/>
     </w:p>
     <w:sectPr>
       <w:pgSz w:w="12240" w:h="15840"/>

</xml_diff>

<commit_message>
Fix: prevented the schedules to run multiple times after some days of not pinging
</commit_message>
<xml_diff>
--- a/doc/VTU API PLAN.docx
+++ b/doc/VTU API PLAN.docx
@@ -2154,8 +2154,348 @@
         </w:rPr>
         <w:t>The Ping functionality was the main problem of the project, I understood this why building it.</w:t>
       </w:r>
+    </w:p>
+    <w:p>
+      <w:pPr>
+        <w:rPr>
+          <w:sz w:val="24"/>
+          <w:szCs w:val="24"/>
+        </w:rPr>
+      </w:pPr>
+    </w:p>
+    <w:p>
+      <w:pPr>
+        <w:rPr>
+          <w:sz w:val="24"/>
+          <w:szCs w:val="24"/>
+        </w:rPr>
+      </w:pPr>
+      <w:r>
+        <w:rPr>
+          <w:sz w:val="24"/>
+          <w:szCs w:val="24"/>
+        </w:rPr>
+        <w:t xml:space="preserve">So every schedule = processing, and frequency = “daily, monthly” should turn processing to pending, after 24hr  </w:t>
+      </w:r>
+    </w:p>
+    <w:p>
+      <w:pPr>
+        <w:rPr>
+          <w:sz w:val="24"/>
+          <w:szCs w:val="24"/>
+        </w:rPr>
+      </w:pPr>
+      <w:r>
+        <w:rPr>
+          <w:sz w:val="24"/>
+          <w:szCs w:val="24"/>
+        </w:rPr>
+        <w:t>If</w:t>
+      </w:r>
+      <w:r>
+        <w:rPr>
+          <w:sz w:val="24"/>
+          <w:szCs w:val="24"/>
+        </w:rPr>
+        <w:t xml:space="preserve"> </w:t>
+      </w:r>
+      <w:r>
+        <w:rPr>
+          <w:color w:val="00B050"/>
+          <w:sz w:val="24"/>
+          <w:szCs w:val="24"/>
+        </w:rPr>
+        <w:t>frequency =</w:t>
+      </w:r>
+      <w:r>
+        <w:rPr>
+          <w:color w:val="00B050"/>
+          <w:sz w:val="24"/>
+          <w:szCs w:val="24"/>
+        </w:rPr>
+        <w:t xml:space="preserve"> daily</w:t>
+      </w:r>
+      <w:r>
+        <w:rPr>
+          <w:sz w:val="24"/>
+          <w:szCs w:val="24"/>
+        </w:rPr>
+        <w:t>:</w:t>
+      </w:r>
+    </w:p>
+    <w:p>
+      <w:pPr>
+        <w:rPr>
+          <w:sz w:val="24"/>
+          <w:szCs w:val="24"/>
+        </w:rPr>
+      </w:pPr>
+      <w:r>
+        <w:rPr>
+          <w:sz w:val="24"/>
+          <w:szCs w:val="24"/>
+        </w:rPr>
+        <w:tab/>
+        <w:t xml:space="preserve">Change </w:t>
+      </w:r>
+      <w:r>
+        <w:rPr>
+          <w:color w:val="FF0000"/>
+          <w:sz w:val="24"/>
+          <w:szCs w:val="24"/>
+        </w:rPr>
+        <w:t xml:space="preserve">Status = pending </w:t>
+      </w:r>
+      <w:r>
+        <w:rPr>
+          <w:sz w:val="24"/>
+          <w:szCs w:val="24"/>
+        </w:rPr>
+        <w:t>every 24hrs</w:t>
+      </w:r>
+      <w:r>
+        <w:rPr>
+          <w:sz w:val="24"/>
+          <w:szCs w:val="24"/>
+        </w:rPr>
+        <w:t xml:space="preserve"> – we’ll be using the </w:t>
+      </w:r>
+      <w:proofErr w:type="spellStart"/>
+      <w:r>
+        <w:rPr>
+          <w:sz w:val="24"/>
+          <w:szCs w:val="24"/>
+        </w:rPr>
+        <w:t>the</w:t>
+      </w:r>
+      <w:proofErr w:type="spellEnd"/>
+      <w:r>
+        <w:rPr>
+          <w:sz w:val="24"/>
+          <w:szCs w:val="24"/>
+        </w:rPr>
+        <w:t xml:space="preserve"> schedule time to check for the time</w:t>
+      </w:r>
+    </w:p>
+    <w:p>
+      <w:pPr>
+        <w:rPr>
+          <w:sz w:val="24"/>
+          <w:szCs w:val="24"/>
+        </w:rPr>
+      </w:pPr>
+      <w:r>
+        <w:rPr>
+          <w:sz w:val="24"/>
+          <w:szCs w:val="24"/>
+        </w:rPr>
+        <w:t>If</w:t>
+      </w:r>
+      <w:r>
+        <w:rPr>
+          <w:sz w:val="24"/>
+          <w:szCs w:val="24"/>
+        </w:rPr>
+        <w:t xml:space="preserve"> </w:t>
+      </w:r>
+      <w:r>
+        <w:rPr>
+          <w:color w:val="00B050"/>
+          <w:sz w:val="24"/>
+          <w:szCs w:val="24"/>
+        </w:rPr>
+        <w:t>frequency =</w:t>
+      </w:r>
+      <w:r>
+        <w:rPr>
+          <w:color w:val="00B050"/>
+          <w:sz w:val="24"/>
+          <w:szCs w:val="24"/>
+        </w:rPr>
+        <w:t xml:space="preserve"> monthly</w:t>
+      </w:r>
+      <w:r>
+        <w:rPr>
+          <w:sz w:val="24"/>
+          <w:szCs w:val="24"/>
+        </w:rPr>
+        <w:t>:</w:t>
+      </w:r>
+    </w:p>
+    <w:p>
+      <w:pPr>
+        <w:rPr>
+          <w:sz w:val="24"/>
+          <w:szCs w:val="24"/>
+        </w:rPr>
+      </w:pPr>
+      <w:r>
+        <w:rPr>
+          <w:sz w:val="24"/>
+          <w:szCs w:val="24"/>
+        </w:rPr>
+        <w:lastRenderedPageBreak/>
+        <w:tab/>
+        <w:t xml:space="preserve">Change </w:t>
+      </w:r>
+      <w:r>
+        <w:rPr>
+          <w:color w:val="FF0000"/>
+          <w:sz w:val="24"/>
+          <w:szCs w:val="24"/>
+        </w:rPr>
+        <w:t xml:space="preserve">Status = pending </w:t>
+      </w:r>
+      <w:r>
+        <w:rPr>
+          <w:sz w:val="24"/>
+          <w:szCs w:val="24"/>
+        </w:rPr>
+        <w:t xml:space="preserve">every </w:t>
+      </w:r>
+      <w:r>
+        <w:rPr>
+          <w:sz w:val="24"/>
+          <w:szCs w:val="24"/>
+        </w:rPr>
+        <w:t xml:space="preserve">720hr (1 month) </w:t>
+      </w:r>
+      <w:r>
+        <w:rPr>
+          <w:sz w:val="24"/>
+          <w:szCs w:val="24"/>
+        </w:rPr>
+        <w:t xml:space="preserve">– we’ll be using the </w:t>
+      </w:r>
+      <w:proofErr w:type="spellStart"/>
+      <w:r>
+        <w:rPr>
+          <w:sz w:val="24"/>
+          <w:szCs w:val="24"/>
+        </w:rPr>
+        <w:t>the</w:t>
+      </w:r>
+      <w:proofErr w:type="spellEnd"/>
+      <w:r>
+        <w:rPr>
+          <w:sz w:val="24"/>
+          <w:szCs w:val="24"/>
+        </w:rPr>
+        <w:t xml:space="preserve"> schedule time to check for the time</w:t>
+      </w:r>
+    </w:p>
+    <w:p>
+      <w:pPr>
+        <w:rPr>
+          <w:sz w:val="24"/>
+          <w:szCs w:val="24"/>
+        </w:rPr>
+      </w:pPr>
+    </w:p>
+    <w:p>
+      <w:pPr>
+        <w:rPr>
+          <w:sz w:val="24"/>
+          <w:szCs w:val="24"/>
+        </w:rPr>
+      </w:pPr>
+      <w:r>
+        <w:rPr>
+          <w:sz w:val="24"/>
+          <w:szCs w:val="24"/>
+        </w:rPr>
+        <w:t>Calculation:</w:t>
+      </w:r>
+    </w:p>
+    <w:p>
+      <w:pPr>
+        <w:rPr>
+          <w:sz w:val="24"/>
+          <w:szCs w:val="24"/>
+        </w:rPr>
+      </w:pPr>
+      <w:proofErr w:type="gramStart"/>
+      <w:r>
+        <w:rPr>
+          <w:sz w:val="24"/>
+          <w:szCs w:val="24"/>
+        </w:rPr>
+        <w:t>daily</w:t>
+      </w:r>
+      <w:proofErr w:type="gramEnd"/>
+    </w:p>
+    <w:p>
+      <w:pPr>
+        <w:rPr>
+          <w:sz w:val="24"/>
+          <w:szCs w:val="24"/>
+        </w:rPr>
+      </w:pPr>
+      <w:proofErr w:type="spellStart"/>
+      <w:r>
+        <w:rPr>
+          <w:sz w:val="24"/>
+          <w:szCs w:val="24"/>
+        </w:rPr>
+        <w:t>Sch</w:t>
+      </w:r>
+      <w:proofErr w:type="spellEnd"/>
+      <w:r>
+        <w:rPr>
+          <w:sz w:val="24"/>
+          <w:szCs w:val="24"/>
+        </w:rPr>
+        <w:t>:</w:t>
+      </w:r>
+      <w:r>
+        <w:rPr>
+          <w:sz w:val="24"/>
+          <w:szCs w:val="24"/>
+        </w:rPr>
+        <w:t xml:space="preserve"> day </w:t>
+      </w:r>
+      <w:proofErr w:type="spellStart"/>
+      <w:r>
+        <w:rPr>
+          <w:sz w:val="24"/>
+          <w:szCs w:val="24"/>
+        </w:rPr>
+        <w:t>last</w:t>
+      </w:r>
+      <w:r>
+        <w:rPr>
+          <w:sz w:val="24"/>
+          <w:szCs w:val="24"/>
+        </w:rPr>
+        <w:t>RunAt</w:t>
+      </w:r>
+      <w:proofErr w:type="spellEnd"/>
+      <w:r>
+        <w:rPr>
+          <w:sz w:val="24"/>
+          <w:szCs w:val="24"/>
+        </w:rPr>
+        <w:t xml:space="preserve"> &lt; today then </w:t>
+      </w:r>
+      <w:proofErr w:type="spellStart"/>
+      <w:r>
+        <w:rPr>
+          <w:sz w:val="24"/>
+          <w:szCs w:val="24"/>
+        </w:rPr>
+        <w:t>runnn</w:t>
+      </w:r>
       <w:bookmarkStart w:id="0" w:name="_GoBack"/>
-      <w:bookmarkEnd w:id="0"/>
+      <w:proofErr w:type="spellEnd"/>
+    </w:p>
+    <w:bookmarkEnd w:id="0"/>
+    <w:p>
+      <w:pPr>
+        <w:rPr>
+          <w:sz w:val="24"/>
+          <w:szCs w:val="24"/>
+        </w:rPr>
+      </w:pPr>
     </w:p>
     <w:sectPr>
       <w:pgSz w:w="12240" w:h="15840"/>

</xml_diff>